<commit_message>
Type Docs: Updated documentation finwise-app
</commit_message>
<xml_diff>
--- a/Documentation FinWise.docx
+++ b/Documentation FinWise.docx
@@ -10,7 +10,6 @@
           <w:docPartUnique/>
         </w:docPartObj>
       </w:sdtPr>
-      <w:sdtEndPr/>
       <w:sdtContent>
         <w:p>
           <w:r>
@@ -357,7 +356,6 @@
                                   <w:dataBinding w:prefixMappings="xmlns:ns0='http://purl.org/dc/elements/1.1/' xmlns:ns1='http://schemas.openxmlformats.org/package/2006/metadata/core-properties' " w:xpath="/ns1:coreProperties[1]/ns0:creator[1]" w:storeItemID="{6C3C8BC8-F283-45AE-878A-BAB7291924A1}"/>
                                   <w:text/>
                                 </w:sdtPr>
-                                <w:sdtEndPr/>
                                 <w:sdtContent>
                                   <w:p>
                                     <w:pPr>
@@ -404,7 +402,6 @@
                                     <w:dataBinding w:prefixMappings="xmlns:ns0='http://schemas.microsoft.com/office/2006/coverPageProps' " w:xpath="/ns0:CoverPageProperties[1]/ns0:CompanyEmail[1]" w:storeItemID="{55AF091B-3C7A-41E3-B477-F2FDAA23CFDA}"/>
                                     <w:text/>
                                   </w:sdtPr>
-                                  <w:sdtEndPr/>
                                   <w:sdtContent>
                                     <w:r>
                                       <w:rPr>
@@ -460,7 +457,6 @@
                             <w:dataBinding w:prefixMappings="xmlns:ns0='http://purl.org/dc/elements/1.1/' xmlns:ns1='http://schemas.openxmlformats.org/package/2006/metadata/core-properties' " w:xpath="/ns1:coreProperties[1]/ns0:creator[1]" w:storeItemID="{6C3C8BC8-F283-45AE-878A-BAB7291924A1}"/>
                             <w:text/>
                           </w:sdtPr>
-                          <w:sdtEndPr/>
                           <w:sdtContent>
                             <w:p>
                               <w:pPr>
@@ -507,7 +503,6 @@
                               <w:dataBinding w:prefixMappings="xmlns:ns0='http://schemas.microsoft.com/office/2006/coverPageProps' " w:xpath="/ns0:CoverPageProperties[1]/ns0:CompanyEmail[1]" w:storeItemID="{55AF091B-3C7A-41E3-B477-F2FDAA23CFDA}"/>
                               <w:text/>
                             </w:sdtPr>
-                            <w:sdtEndPr/>
                             <w:sdtContent>
                               <w:r>
                                 <w:rPr>
@@ -626,7 +621,6 @@
                                   <w:dataBinding w:prefixMappings="xmlns:ns0='http://schemas.microsoft.com/office/2006/coverPageProps' " w:xpath="/ns0:CoverPageProperties[1]/ns0:Abstract[1]" w:storeItemID="{55AF091B-3C7A-41E3-B477-F2FDAA23CFDA}"/>
                                   <w:text w:multiLine="1"/>
                                 </w:sdtPr>
-                                <w:sdtEndPr/>
                                 <w:sdtContent>
                                   <w:p>
                                     <w:pPr>
@@ -726,7 +720,6 @@
                             <w:dataBinding w:prefixMappings="xmlns:ns0='http://schemas.microsoft.com/office/2006/coverPageProps' " w:xpath="/ns0:CoverPageProperties[1]/ns0:Abstract[1]" w:storeItemID="{55AF091B-3C7A-41E3-B477-F2FDAA23CFDA}"/>
                             <w:text w:multiLine="1"/>
                           </w:sdtPr>
-                          <w:sdtEndPr/>
                           <w:sdtContent>
                             <w:p>
                               <w:pPr>
@@ -892,7 +885,6 @@
                                   <w:dataBinding w:prefixMappings="xmlns:ns0='http://purl.org/dc/elements/1.1/' xmlns:ns1='http://schemas.openxmlformats.org/package/2006/metadata/core-properties' " w:xpath="/ns1:coreProperties[1]/ns0:subject[1]" w:storeItemID="{6C3C8BC8-F283-45AE-878A-BAB7291924A1}"/>
                                   <w:text/>
                                 </w:sdtPr>
-                                <w:sdtEndPr/>
                                 <w:sdtContent>
                                   <w:p>
                                     <w:pPr>
@@ -994,7 +986,6 @@
                             <w:dataBinding w:prefixMappings="xmlns:ns0='http://purl.org/dc/elements/1.1/' xmlns:ns1='http://schemas.openxmlformats.org/package/2006/metadata/core-properties' " w:xpath="/ns1:coreProperties[1]/ns0:subject[1]" w:storeItemID="{6C3C8BC8-F283-45AE-878A-BAB7291924A1}"/>
                             <w:text/>
                           </w:sdtPr>
-                          <w:sdtEndPr/>
                           <w:sdtContent>
                             <w:p>
                               <w:pPr>
@@ -1075,7 +1066,9 @@
               <w:tab w:val="right" w:leader="dot" w:pos="8828"/>
             </w:tabs>
             <w:rPr>
+              <w:rFonts w:eastAsiaTheme="minorEastAsia"/>
               <w:noProof/>
+              <w:lang w:eastAsia="es-CO"/>
             </w:rPr>
           </w:pPr>
           <w:r>
@@ -1087,7 +1080,7 @@
           <w:r>
             <w:fldChar w:fldCharType="separate"/>
           </w:r>
-          <w:hyperlink w:anchor="_Toc235024289" w:history="1">
+          <w:hyperlink w:anchor="_Toc235089152" w:history="1">
             <w:r>
               <w:rPr>
                 <w:rStyle w:val="Hipervnculo"/>
@@ -1116,7 +1109,145 @@
                 <w:noProof/>
                 <w:webHidden/>
               </w:rPr>
-              <w:instrText xml:space="preserve"> PAGEREF _Toc235024289 \h </w:instrText>
+              <w:instrText xml:space="preserve"> PAGEREF _Toc235089152 \h </w:instrText>
+            </w:r>
+            <w:r>
+              <w:rPr>
+                <w:noProof/>
+                <w:webHidden/>
+              </w:rPr>
+            </w:r>
+            <w:r>
+              <w:rPr>
+                <w:noProof/>
+                <w:webHidden/>
+              </w:rPr>
+              <w:fldChar w:fldCharType="separate"/>
+            </w:r>
+            <w:r>
+              <w:rPr>
+                <w:noProof/>
+                <w:webHidden/>
+              </w:rPr>
+              <w:t>2</w:t>
+            </w:r>
+            <w:r>
+              <w:rPr>
+                <w:noProof/>
+                <w:webHidden/>
+              </w:rPr>
+              <w:fldChar w:fldCharType="end"/>
+            </w:r>
+          </w:hyperlink>
+        </w:p>
+        <w:p>
+          <w:pPr>
+            <w:pStyle w:val="TDC2"/>
+            <w:tabs>
+              <w:tab w:val="right" w:leader="dot" w:pos="8828"/>
+            </w:tabs>
+            <w:rPr>
+              <w:noProof/>
+            </w:rPr>
+          </w:pPr>
+          <w:hyperlink w:anchor="_Toc235089153" w:history="1">
+            <w:r>
+              <w:rPr>
+                <w:rStyle w:val="Hipervnculo"/>
+                <w:b/>
+                <w:bCs/>
+                <w:noProof/>
+              </w:rPr>
+              <w:t>Instalar Dependencias</w:t>
+            </w:r>
+            <w:r>
+              <w:rPr>
+                <w:noProof/>
+                <w:webHidden/>
+              </w:rPr>
+              <w:tab/>
+            </w:r>
+            <w:r>
+              <w:rPr>
+                <w:noProof/>
+                <w:webHidden/>
+              </w:rPr>
+              <w:fldChar w:fldCharType="begin"/>
+            </w:r>
+            <w:r>
+              <w:rPr>
+                <w:noProof/>
+                <w:webHidden/>
+              </w:rPr>
+              <w:instrText xml:space="preserve"> PAGEREF _Toc235089153 \h </w:instrText>
+            </w:r>
+            <w:r>
+              <w:rPr>
+                <w:noProof/>
+                <w:webHidden/>
+              </w:rPr>
+            </w:r>
+            <w:r>
+              <w:rPr>
+                <w:noProof/>
+                <w:webHidden/>
+              </w:rPr>
+              <w:fldChar w:fldCharType="separate"/>
+            </w:r>
+            <w:r>
+              <w:rPr>
+                <w:noProof/>
+                <w:webHidden/>
+              </w:rPr>
+              <w:t>2</w:t>
+            </w:r>
+            <w:r>
+              <w:rPr>
+                <w:noProof/>
+                <w:webHidden/>
+              </w:rPr>
+              <w:fldChar w:fldCharType="end"/>
+            </w:r>
+          </w:hyperlink>
+        </w:p>
+        <w:p>
+          <w:pPr>
+            <w:pStyle w:val="TDC3"/>
+            <w:tabs>
+              <w:tab w:val="right" w:leader="dot" w:pos="8828"/>
+            </w:tabs>
+            <w:rPr>
+              <w:noProof/>
+            </w:rPr>
+          </w:pPr>
+          <w:hyperlink w:anchor="_Toc235089154" w:history="1">
+            <w:r>
+              <w:rPr>
+                <w:rStyle w:val="Hipervnculo"/>
+                <w:noProof/>
+              </w:rPr>
+              <w:t>Instalar Dependencias de Mongoose para Manejo con MongoDB</w:t>
+            </w:r>
+            <w:r>
+              <w:rPr>
+                <w:noProof/>
+                <w:webHidden/>
+              </w:rPr>
+              <w:tab/>
+            </w:r>
+            <w:r>
+              <w:rPr>
+                <w:noProof/>
+                <w:webHidden/>
+              </w:rPr>
+              <w:fldChar w:fldCharType="begin"/>
+            </w:r>
+            <w:r>
+              <w:rPr>
+                <w:noProof/>
+                <w:webHidden/>
+              </w:rPr>
+              <w:instrText xml:space="preserve"> PAGEREF _Toc235089154 \h </w:instrText>
             </w:r>
             <w:r>
               <w:rPr>
@@ -1179,9 +1310,6 @@
     <w:p/>
     <w:p/>
     <w:p/>
-    <w:p/>
-    <w:p/>
-    <w:p/>
     <w:p>
       <w:pPr>
         <w:pStyle w:val="Ttulo1"/>
@@ -1191,7 +1319,7 @@
           <w:bCs/>
         </w:rPr>
       </w:pPr>
-      <w:bookmarkStart w:id="0" w:name="_Toc235024289"/>
+      <w:bookmarkStart w:id="0" w:name="_Toc235089152"/>
       <w:r>
         <w:rPr>
           <w:b/>
@@ -1211,6 +1339,7 @@
           <w:bCs/>
         </w:rPr>
       </w:pPr>
+      <w:bookmarkStart w:id="1" w:name="_Toc235089153"/>
       <w:r>
         <w:rPr>
           <w:b/>
@@ -1218,6 +1347,7 @@
         </w:rPr>
         <w:t>Instalar Dependencias</w:t>
       </w:r>
+      <w:bookmarkEnd w:id="1"/>
     </w:p>
     <w:p>
       <w:r>
@@ -1244,11 +1374,9 @@
       <w:r>
         <w:t xml:space="preserve"> </w:t>
       </w:r>
-      <w:proofErr w:type="gramStart"/>
-      <w:r>
-        <w:t>primeramente</w:t>
-      </w:r>
-      <w:proofErr w:type="gramEnd"/>
+      <w:r>
+        <w:t>primeramente,</w:t>
+      </w:r>
       <w:r>
         <w:t xml:space="preserve"> después de clonar el repositorio </w:t>
       </w:r>
@@ -1343,6 +1471,635 @@
         </w:drawing>
       </w:r>
     </w:p>
+    <w:p>
+      <w:r>
+        <w:t>Verificamos:</w:t>
+      </w:r>
+    </w:p>
+    <w:p>
+      <w:pPr>
+        <w:rPr>
+          <w:b/>
+          <w:bCs/>
+        </w:rPr>
+      </w:pPr>
+      <w:proofErr w:type="spellStart"/>
+      <w:r>
+        <w:rPr>
+          <w:b/>
+          <w:bCs/>
+        </w:rPr>
+        <w:t>nest</w:t>
+      </w:r>
+      <w:proofErr w:type="spellEnd"/>
+      <w:r>
+        <w:rPr>
+          <w:b/>
+          <w:bCs/>
+        </w:rPr>
+        <w:t xml:space="preserve"> --</w:t>
+      </w:r>
+      <w:proofErr w:type="spellStart"/>
+      <w:r>
+        <w:rPr>
+          <w:b/>
+          <w:bCs/>
+        </w:rPr>
+        <w:t>version</w:t>
+      </w:r>
+      <w:proofErr w:type="spellEnd"/>
+    </w:p>
+    <w:p>
+      <w:r>
+        <w:drawing>
+          <wp:inline distT="0" distB="0" distL="0" distR="0" wp14:anchorId="278D9334" wp14:editId="7D54FD7D">
+            <wp:extent cx="5144218" cy="543001"/>
+            <wp:effectExtent l="0" t="0" r="0" b="9525"/>
+            <wp:docPr id="1039698854" name="Imagen 1"/>
+            <wp:cNvGraphicFramePr>
+              <a:graphicFrameLocks xmlns:a="http://schemas.openxmlformats.org/drawingml/2006/main" noChangeAspect="1"/>
+            </wp:cNvGraphicFramePr>
+            <a:graphic xmlns:a="http://schemas.openxmlformats.org/drawingml/2006/main">
+              <a:graphicData uri="http://schemas.openxmlformats.org/drawingml/2006/picture">
+                <pic:pic xmlns:pic="http://schemas.openxmlformats.org/drawingml/2006/picture">
+                  <pic:nvPicPr>
+                    <pic:cNvPr id="1039698854" name=""/>
+                    <pic:cNvPicPr/>
+                  </pic:nvPicPr>
+                  <pic:blipFill>
+                    <a:blip r:embed="rId10"/>
+                    <a:stretch>
+                      <a:fillRect/>
+                    </a:stretch>
+                  </pic:blipFill>
+                  <pic:spPr>
+                    <a:xfrm>
+                      <a:off x="0" y="0"/>
+                      <a:ext cx="5144218" cy="543001"/>
+                    </a:xfrm>
+                    <a:prstGeom prst="rect">
+                      <a:avLst/>
+                    </a:prstGeom>
+                  </pic:spPr>
+                </pic:pic>
+              </a:graphicData>
+            </a:graphic>
+          </wp:inline>
+        </w:drawing>
+      </w:r>
+    </w:p>
+    <w:p>
+      <w:pPr>
+        <w:pStyle w:val="Ttulo2"/>
+        <w:rPr>
+          <w:b/>
+          <w:bCs/>
+        </w:rPr>
+      </w:pPr>
+      <w:r>
+        <w:rPr>
+          <w:b/>
+          <w:bCs/>
+        </w:rPr>
+        <w:t>Comando para Crear Aplicación</w:t>
+      </w:r>
+    </w:p>
+    <w:p>
+      <w:r>
+        <w:t>Una vez instaladas las dependencias damos comando para instalar nuestra aplicación:</w:t>
+      </w:r>
+    </w:p>
+    <w:p>
+      <w:pPr>
+        <w:rPr>
+          <w:b/>
+          <w:bCs/>
+        </w:rPr>
+      </w:pPr>
+      <w:proofErr w:type="spellStart"/>
+      <w:r>
+        <w:rPr>
+          <w:b/>
+          <w:bCs/>
+        </w:rPr>
+        <w:t>nest</w:t>
+      </w:r>
+      <w:proofErr w:type="spellEnd"/>
+      <w:r>
+        <w:rPr>
+          <w:b/>
+          <w:bCs/>
+        </w:rPr>
+        <w:t xml:space="preserve"> new </w:t>
+      </w:r>
+      <w:proofErr w:type="spellStart"/>
+      <w:r>
+        <w:rPr>
+          <w:b/>
+          <w:bCs/>
+        </w:rPr>
+        <w:t>finwise-backend</w:t>
+      </w:r>
+      <w:proofErr w:type="spellEnd"/>
+    </w:p>
+    <w:p>
+      <w:r>
+        <w:t>Te preguntará qué gestor de paquetes prefieres (</w:t>
+      </w:r>
+      <w:proofErr w:type="spellStart"/>
+      <w:r>
+        <w:t>npm</w:t>
+      </w:r>
+      <w:proofErr w:type="spellEnd"/>
+      <w:r>
+        <w:t xml:space="preserve"> o </w:t>
+      </w:r>
+      <w:proofErr w:type="spellStart"/>
+      <w:r>
+        <w:t>yarn</w:t>
+      </w:r>
+      <w:proofErr w:type="spellEnd"/>
+      <w:r>
+        <w:t>). El</w:t>
+      </w:r>
+      <w:r>
+        <w:t>egir</w:t>
+      </w:r>
+      <w:r>
+        <w:t xml:space="preserve"> </w:t>
+      </w:r>
+      <w:proofErr w:type="spellStart"/>
+      <w:r>
+        <w:t>npm</w:t>
+      </w:r>
+      <w:proofErr w:type="spellEnd"/>
+      <w:r>
+        <w:t xml:space="preserve"> (es el más común).</w:t>
+      </w:r>
+    </w:p>
+    <w:p>
+      <w:r>
+        <w:t>Esto creará una carpeta con la estructura básica.</w:t>
+      </w:r>
+    </w:p>
+    <w:p>
+      <w:pPr>
+        <w:pStyle w:val="Ttulo3"/>
+      </w:pPr>
+      <w:bookmarkStart w:id="2" w:name="_Toc235089154"/>
+      <w:r>
+        <w:t xml:space="preserve">Instalar Dependencias de </w:t>
+      </w:r>
+      <w:proofErr w:type="spellStart"/>
+      <w:r>
+        <w:t>Mongoose</w:t>
+      </w:r>
+      <w:proofErr w:type="spellEnd"/>
+      <w:r>
+        <w:t xml:space="preserve"> para Manejo con MongoDB</w:t>
+      </w:r>
+      <w:bookmarkEnd w:id="2"/>
+    </w:p>
+    <w:p>
+      <w:r>
+        <w:t>Es importante la descarga d</w:t>
+      </w:r>
+      <w:r>
+        <w:t xml:space="preserve">e estas dependencias para permitir la conexión con </w:t>
+      </w:r>
+      <w:proofErr w:type="spellStart"/>
+      <w:r>
+        <w:t>mongoDB</w:t>
+      </w:r>
+      <w:proofErr w:type="spellEnd"/>
+      <w:r>
+        <w:t>.</w:t>
+      </w:r>
+    </w:p>
+    <w:p>
+      <w:pPr>
+        <w:rPr>
+          <w:b/>
+          <w:bCs/>
+          <w:lang w:val="en-US"/>
+        </w:rPr>
+      </w:pPr>
+      <w:proofErr w:type="spellStart"/>
+      <w:proofErr w:type="gramStart"/>
+      <w:r>
+        <w:rPr>
+          <w:b/>
+          <w:bCs/>
+          <w:lang w:val="en-US"/>
+        </w:rPr>
+        <w:t>npm</w:t>
+      </w:r>
+      <w:proofErr w:type="spellEnd"/>
+      <w:r>
+        <w:rPr>
+          <w:b/>
+          <w:bCs/>
+          <w:lang w:val="en-US"/>
+        </w:rPr>
+        <w:t xml:space="preserve"> install @</w:t>
+      </w:r>
+      <w:proofErr w:type="gramEnd"/>
+      <w:r>
+        <w:rPr>
+          <w:b/>
+          <w:bCs/>
+          <w:lang w:val="en-US"/>
+        </w:rPr>
+        <w:t xml:space="preserve">nestjs/mongoose </w:t>
+      </w:r>
+      <w:proofErr w:type="gramStart"/>
+      <w:r>
+        <w:rPr>
+          <w:b/>
+          <w:bCs/>
+          <w:lang w:val="en-US"/>
+        </w:rPr>
+        <w:t>mongoose</w:t>
+      </w:r>
+      <w:proofErr w:type="gramEnd"/>
+    </w:p>
+    <w:p>
+      <w:pPr>
+        <w:rPr>
+          <w:b/>
+          <w:bCs/>
+          <w:lang w:val="en-US"/>
+        </w:rPr>
+      </w:pPr>
+      <w:r>
+        <w:rPr>
+          <w:b/>
+          <w:bCs/>
+        </w:rPr>
+        <w:lastRenderedPageBreak/>
+        <w:drawing>
+          <wp:inline distT="0" distB="0" distL="0" distR="0" wp14:anchorId="087973B3" wp14:editId="3658584B">
+            <wp:extent cx="5096586" cy="1152686"/>
+            <wp:effectExtent l="0" t="0" r="0" b="9525"/>
+            <wp:docPr id="976131626" name="Imagen 1"/>
+            <wp:cNvGraphicFramePr>
+              <a:graphicFrameLocks xmlns:a="http://schemas.openxmlformats.org/drawingml/2006/main" noChangeAspect="1"/>
+            </wp:cNvGraphicFramePr>
+            <a:graphic xmlns:a="http://schemas.openxmlformats.org/drawingml/2006/main">
+              <a:graphicData uri="http://schemas.openxmlformats.org/drawingml/2006/picture">
+                <pic:pic xmlns:pic="http://schemas.openxmlformats.org/drawingml/2006/picture">
+                  <pic:nvPicPr>
+                    <pic:cNvPr id="976131626" name=""/>
+                    <pic:cNvPicPr/>
+                  </pic:nvPicPr>
+                  <pic:blipFill>
+                    <a:blip r:embed="rId11"/>
+                    <a:stretch>
+                      <a:fillRect/>
+                    </a:stretch>
+                  </pic:blipFill>
+                  <pic:spPr>
+                    <a:xfrm>
+                      <a:off x="0" y="0"/>
+                      <a:ext cx="5096586" cy="1152686"/>
+                    </a:xfrm>
+                    <a:prstGeom prst="rect">
+                      <a:avLst/>
+                    </a:prstGeom>
+                  </pic:spPr>
+                </pic:pic>
+              </a:graphicData>
+            </a:graphic>
+          </wp:inline>
+        </w:drawing>
+      </w:r>
+    </w:p>
+    <w:p>
+      <w:pPr>
+        <w:rPr>
+          <w:b/>
+          <w:bCs/>
+          <w:lang w:val="en-US"/>
+        </w:rPr>
+      </w:pPr>
+    </w:p>
+    <w:p>
+      <w:pPr>
+        <w:pStyle w:val="Ttulo2"/>
+        <w:rPr>
+          <w:b/>
+          <w:bCs/>
+        </w:rPr>
+      </w:pPr>
+      <w:r>
+        <w:rPr>
+          <w:b/>
+          <w:bCs/>
+        </w:rPr>
+        <w:t xml:space="preserve">Comando </w:t>
+      </w:r>
+      <w:proofErr w:type="spellStart"/>
+      <w:r>
+        <w:rPr>
+          <w:b/>
+          <w:bCs/>
+        </w:rPr>
+        <w:t>NestJS</w:t>
+      </w:r>
+      <w:proofErr w:type="spellEnd"/>
+      <w:r>
+        <w:rPr>
+          <w:b/>
+          <w:bCs/>
+        </w:rPr>
+        <w:t xml:space="preserve"> para Arrancar</w:t>
+      </w:r>
+    </w:p>
+    <w:p>
+      <w:r>
+        <w:t>Para arrancar el servidor damos el comando:</w:t>
+      </w:r>
+    </w:p>
+    <w:p>
+      <w:pPr>
+        <w:rPr>
+          <w:b/>
+          <w:bCs/>
+        </w:rPr>
+      </w:pPr>
+      <w:proofErr w:type="spellStart"/>
+      <w:r>
+        <w:rPr>
+          <w:b/>
+          <w:bCs/>
+        </w:rPr>
+        <w:t>npm</w:t>
+      </w:r>
+      <w:proofErr w:type="spellEnd"/>
+      <w:r>
+        <w:rPr>
+          <w:b/>
+          <w:bCs/>
+        </w:rPr>
+        <w:t xml:space="preserve"> run </w:t>
+      </w:r>
+      <w:proofErr w:type="spellStart"/>
+      <w:proofErr w:type="gramStart"/>
+      <w:r>
+        <w:rPr>
+          <w:b/>
+          <w:bCs/>
+        </w:rPr>
+        <w:t>start:dev</w:t>
+      </w:r>
+      <w:proofErr w:type="spellEnd"/>
+      <w:proofErr w:type="gramEnd"/>
+    </w:p>
+    <w:p>
+      <w:r>
+        <w:drawing>
+          <wp:inline distT="0" distB="0" distL="0" distR="0" wp14:anchorId="1A8ED557" wp14:editId="749B2858">
+            <wp:extent cx="5125165" cy="800212"/>
+            <wp:effectExtent l="0" t="0" r="0" b="0"/>
+            <wp:docPr id="415070001" name="Imagen 1"/>
+            <wp:cNvGraphicFramePr>
+              <a:graphicFrameLocks xmlns:a="http://schemas.openxmlformats.org/drawingml/2006/main" noChangeAspect="1"/>
+            </wp:cNvGraphicFramePr>
+            <a:graphic xmlns:a="http://schemas.openxmlformats.org/drawingml/2006/main">
+              <a:graphicData uri="http://schemas.openxmlformats.org/drawingml/2006/picture">
+                <pic:pic xmlns:pic="http://schemas.openxmlformats.org/drawingml/2006/picture">
+                  <pic:nvPicPr>
+                    <pic:cNvPr id="415070001" name=""/>
+                    <pic:cNvPicPr/>
+                  </pic:nvPicPr>
+                  <pic:blipFill>
+                    <a:blip r:embed="rId12"/>
+                    <a:stretch>
+                      <a:fillRect/>
+                    </a:stretch>
+                  </pic:blipFill>
+                  <pic:spPr>
+                    <a:xfrm>
+                      <a:off x="0" y="0"/>
+                      <a:ext cx="5125165" cy="800212"/>
+                    </a:xfrm>
+                    <a:prstGeom prst="rect">
+                      <a:avLst/>
+                    </a:prstGeom>
+                  </pic:spPr>
+                </pic:pic>
+              </a:graphicData>
+            </a:graphic>
+          </wp:inline>
+        </w:drawing>
+      </w:r>
+    </w:p>
+    <w:p>
+      <w:r>
+        <w:drawing>
+          <wp:inline distT="0" distB="0" distL="0" distR="0" wp14:anchorId="118FC269" wp14:editId="2D6F6A94">
+            <wp:extent cx="5612130" cy="1865630"/>
+            <wp:effectExtent l="0" t="0" r="7620" b="1270"/>
+            <wp:docPr id="1396456973" name="Imagen 1"/>
+            <wp:cNvGraphicFramePr>
+              <a:graphicFrameLocks xmlns:a="http://schemas.openxmlformats.org/drawingml/2006/main" noChangeAspect="1"/>
+            </wp:cNvGraphicFramePr>
+            <a:graphic xmlns:a="http://schemas.openxmlformats.org/drawingml/2006/main">
+              <a:graphicData uri="http://schemas.openxmlformats.org/drawingml/2006/picture">
+                <pic:pic xmlns:pic="http://schemas.openxmlformats.org/drawingml/2006/picture">
+                  <pic:nvPicPr>
+                    <pic:cNvPr id="1396456973" name=""/>
+                    <pic:cNvPicPr/>
+                  </pic:nvPicPr>
+                  <pic:blipFill>
+                    <a:blip r:embed="rId13"/>
+                    <a:stretch>
+                      <a:fillRect/>
+                    </a:stretch>
+                  </pic:blipFill>
+                  <pic:spPr>
+                    <a:xfrm>
+                      <a:off x="0" y="0"/>
+                      <a:ext cx="5612130" cy="1865630"/>
+                    </a:xfrm>
+                    <a:prstGeom prst="rect">
+                      <a:avLst/>
+                    </a:prstGeom>
+                  </pic:spPr>
+                </pic:pic>
+              </a:graphicData>
+            </a:graphic>
+          </wp:inline>
+        </w:drawing>
+      </w:r>
+    </w:p>
+    <w:p/>
+    <w:p>
+      <w:pPr>
+        <w:pStyle w:val="Ttulo2"/>
+        <w:rPr>
+          <w:b/>
+          <w:bCs/>
+        </w:rPr>
+      </w:pPr>
+      <w:r>
+        <w:rPr>
+          <w:b/>
+          <w:bCs/>
+        </w:rPr>
+        <w:t xml:space="preserve">Generar </w:t>
+      </w:r>
+      <w:r>
+        <w:rPr>
+          <w:b/>
+          <w:bCs/>
+        </w:rPr>
+        <w:t>M</w:t>
+      </w:r>
+      <w:r>
+        <w:rPr>
+          <w:b/>
+          <w:bCs/>
+        </w:rPr>
+        <w:t xml:space="preserve">ódulos, </w:t>
+      </w:r>
+      <w:r>
+        <w:rPr>
+          <w:b/>
+          <w:bCs/>
+        </w:rPr>
+        <w:t>C</w:t>
+      </w:r>
+      <w:r>
+        <w:rPr>
+          <w:b/>
+          <w:bCs/>
+        </w:rPr>
+        <w:t xml:space="preserve">ontroladores y </w:t>
+      </w:r>
+      <w:r>
+        <w:rPr>
+          <w:b/>
+          <w:bCs/>
+        </w:rPr>
+        <w:t>S</w:t>
+      </w:r>
+      <w:r>
+        <w:rPr>
+          <w:b/>
+          <w:bCs/>
+        </w:rPr>
+        <w:t xml:space="preserve">ervicios de </w:t>
+      </w:r>
+      <w:r>
+        <w:rPr>
+          <w:b/>
+          <w:bCs/>
+        </w:rPr>
+        <w:t>C</w:t>
+      </w:r>
+      <w:r>
+        <w:rPr>
+          <w:b/>
+          <w:bCs/>
+        </w:rPr>
+        <w:t xml:space="preserve">ada </w:t>
+      </w:r>
+      <w:r>
+        <w:rPr>
+          <w:b/>
+          <w:bCs/>
+        </w:rPr>
+        <w:t>E</w:t>
+      </w:r>
+      <w:r>
+        <w:rPr>
+          <w:b/>
+          <w:bCs/>
+        </w:rPr>
+        <w:t>ntidad</w:t>
+      </w:r>
+    </w:p>
+    <w:p>
+      <w:r>
+        <w:t>Para generar esta carpeta de cada entidad damos el comando</w:t>
+      </w:r>
+      <w:r>
+        <w:t>. Ejemplo</w:t>
+      </w:r>
+      <w:r>
+        <w:t>:</w:t>
+      </w:r>
+    </w:p>
+    <w:p>
+      <w:pPr>
+        <w:rPr>
+          <w:b/>
+          <w:bCs/>
+        </w:rPr>
+      </w:pPr>
+      <w:proofErr w:type="spellStart"/>
+      <w:r>
+        <w:rPr>
+          <w:b/>
+          <w:bCs/>
+        </w:rPr>
+        <w:t>nest</w:t>
+      </w:r>
+      <w:proofErr w:type="spellEnd"/>
+      <w:r>
+        <w:rPr>
+          <w:b/>
+          <w:bCs/>
+        </w:rPr>
+        <w:t xml:space="preserve"> g </w:t>
+      </w:r>
+      <w:proofErr w:type="spellStart"/>
+      <w:r>
+        <w:rPr>
+          <w:b/>
+          <w:bCs/>
+        </w:rPr>
+        <w:t>resource</w:t>
+      </w:r>
+      <w:proofErr w:type="spellEnd"/>
+      <w:r>
+        <w:rPr>
+          <w:b/>
+          <w:bCs/>
+        </w:rPr>
+        <w:t xml:space="preserve"> </w:t>
+      </w:r>
+      <w:proofErr w:type="spellStart"/>
+      <w:r>
+        <w:rPr>
+          <w:b/>
+          <w:bCs/>
+        </w:rPr>
+        <w:t>monthly-incomes</w:t>
+      </w:r>
+      <w:proofErr w:type="spellEnd"/>
+    </w:p>
+    <w:p>
+      <w:pPr>
+        <w:rPr>
+          <w:b/>
+          <w:bCs/>
+        </w:rPr>
+      </w:pPr>
+    </w:p>
+    <w:p>
+      <w:r>
+        <w:t xml:space="preserve"> </w:t>
+      </w:r>
+    </w:p>
+    <w:p/>
+    <w:p/>
+    <w:p/>
+    <w:p/>
+    <w:p/>
+    <w:p/>
+    <w:p/>
     <w:p>
       <w:pPr>
         <w:rPr>
@@ -1814,7 +2571,6 @@
     <w:next w:val="Normal"/>
     <w:link w:val="Ttulo3Car"/>
     <w:uiPriority w:val="9"/>
-    <w:semiHidden/>
     <w:unhideWhenUsed/>
     <w:qFormat/>
     <w:rsid w:val="00436A74"/>
@@ -1966,7 +2722,6 @@
   <w:style w:type="character" w:default="1" w:styleId="Fuentedeprrafopredeter">
     <w:name w:val="Default Paragraph Font"/>
     <w:uiPriority w:val="1"/>
-    <w:semiHidden/>
     <w:unhideWhenUsed/>
   </w:style>
   <w:style w:type="table" w:default="1" w:styleId="Tablanormal">
@@ -2021,7 +2776,6 @@
     <w:basedOn w:val="Fuentedeprrafopredeter"/>
     <w:link w:val="Ttulo3"/>
     <w:uiPriority w:val="9"/>
-    <w:semiHidden/>
     <w:rsid w:val="00436A74"/>
     <w:rPr>
       <w:rFonts w:eastAsiaTheme="majorEastAsia" w:cstheme="majorBidi"/>
@@ -2354,6 +3108,32 @@
       <w:color w:val="467886" w:themeColor="hyperlink"/>
       <w:u w:val="single"/>
     </w:rPr>
+  </w:style>
+  <w:style w:type="paragraph" w:styleId="TDC2">
+    <w:name w:val="toc 2"/>
+    <w:basedOn w:val="Normal"/>
+    <w:next w:val="Normal"/>
+    <w:autoRedefine/>
+    <w:uiPriority w:val="39"/>
+    <w:unhideWhenUsed/>
+    <w:rsid w:val="007B7012"/>
+    <w:pPr>
+      <w:spacing w:after="100"/>
+      <w:ind w:left="240"/>
+    </w:pPr>
+  </w:style>
+  <w:style w:type="paragraph" w:styleId="TDC3">
+    <w:name w:val="toc 3"/>
+    <w:basedOn w:val="Normal"/>
+    <w:next w:val="Normal"/>
+    <w:autoRedefine/>
+    <w:uiPriority w:val="39"/>
+    <w:unhideWhenUsed/>
+    <w:rsid w:val="007B7012"/>
+    <w:pPr>
+      <w:spacing w:after="100"/>
+      <w:ind w:left="480"/>
+    </w:pPr>
   </w:style>
 </w:styles>
 </file>
@@ -2674,18 +3454,18 @@
 </file>
 
 <file path=customXml/item1.xml><?xml version="1.0" encoding="utf-8"?>
-<p:properties xmlns:p="http://schemas.microsoft.com/office/2006/metadata/properties" xmlns:xsi="http://www.w3.org/2001/XMLSchema-instance" xmlns:pc="http://schemas.microsoft.com/office/infopath/2007/PartnerControls">
-  <documentManagement/>
-</p:properties>
-</file>
-
-<file path=customXml/item2.xml><?xml version="1.0" encoding="utf-8"?>
 <?mso-contentType ?>
 <FormTemplates xmlns="http://schemas.microsoft.com/sharepoint/v3/contenttype/forms">
   <Display>DocumentLibraryForm</Display>
   <Edit>DocumentLibraryForm</Edit>
   <New>DocumentLibraryForm</New>
 </FormTemplates>
+</file>
+
+<file path=customXml/item2.xml><?xml version="1.0" encoding="utf-8"?>
+<p:properties xmlns:p="http://schemas.microsoft.com/office/2006/metadata/properties" xmlns:xsi="http://www.w3.org/2001/XMLSchema-instance" xmlns:pc="http://schemas.microsoft.com/office/infopath/2007/PartnerControls">
+  <documentManagement/>
+</p:properties>
 </file>
 
 <file path=customXml/item3.xml><?xml version="1.0" encoding="utf-8"?>
@@ -2833,18 +3613,18 @@
 </file>
 
 <file path=customXml/itemProps1.xml><?xml version="1.0" encoding="utf-8"?>
-<ds:datastoreItem xmlns:ds="http://schemas.openxmlformats.org/officeDocument/2006/customXml" ds:itemID="{86806066-58CC-48AB-9171-94BA2726B27E}">
+<ds:datastoreItem xmlns:ds="http://schemas.openxmlformats.org/officeDocument/2006/customXml" ds:itemID="{2B93DEC2-8C80-4466-A26F-F7157091F69A}">
   <ds:schemaRefs>
-    <ds:schemaRef ds:uri="http://schemas.microsoft.com/office/2006/metadata/properties"/>
-    <ds:schemaRef ds:uri="http://schemas.microsoft.com/office/infopath/2007/PartnerControls"/>
+    <ds:schemaRef ds:uri="http://schemas.microsoft.com/sharepoint/v3/contenttype/forms"/>
   </ds:schemaRefs>
 </ds:datastoreItem>
 </file>
 
 <file path=customXml/itemProps2.xml><?xml version="1.0" encoding="utf-8"?>
-<ds:datastoreItem xmlns:ds="http://schemas.openxmlformats.org/officeDocument/2006/customXml" ds:itemID="{2B93DEC2-8C80-4466-A26F-F7157091F69A}">
+<ds:datastoreItem xmlns:ds="http://schemas.openxmlformats.org/officeDocument/2006/customXml" ds:itemID="{86806066-58CC-48AB-9171-94BA2726B27E}">
   <ds:schemaRefs>
-    <ds:schemaRef ds:uri="http://schemas.microsoft.com/sharepoint/v3/contenttype/forms"/>
+    <ds:schemaRef ds:uri="http://schemas.microsoft.com/office/2006/metadata/properties"/>
+    <ds:schemaRef ds:uri="http://schemas.microsoft.com/office/infopath/2007/PartnerControls"/>
   </ds:schemaRefs>
 </ds:datastoreItem>
 </file>

</xml_diff>

<commit_message>
FW-07 | Type Feat: A module is generated for each entity with comand nest g resource xxxx.
</commit_message>
<xml_diff>
--- a/Documentation FinWise.docx
+++ b/Documentation FinWise.docx
@@ -1362,17 +1362,12 @@
         <w:t xml:space="preserve"> es con </w:t>
       </w:r>
       <w:proofErr w:type="spellStart"/>
-      <w:proofErr w:type="gramStart"/>
       <w:r>
         <w:t>nestJS</w:t>
       </w:r>
       <w:proofErr w:type="spellEnd"/>
       <w:r>
-        <w:t xml:space="preserve"> ,</w:t>
-      </w:r>
-      <w:proofErr w:type="gramEnd"/>
-      <w:r>
-        <w:t xml:space="preserve"> </w:t>
+        <w:t xml:space="preserve"> , </w:t>
       </w:r>
       <w:r>
         <w:t>primeramente,</w:t>
@@ -1511,6 +1506,9 @@
     </w:p>
     <w:p>
       <w:r>
+        <w:rPr>
+          <w:noProof/>
+        </w:rPr>
         <w:drawing>
           <wp:inline distT="0" distB="0" distL="0" distR="0" wp14:anchorId="278D9334" wp14:editId="7D54FD7D">
             <wp:extent cx="5144218" cy="543001"/>
@@ -1685,7 +1683,6 @@
         </w:rPr>
       </w:pPr>
       <w:proofErr w:type="spellStart"/>
-      <w:proofErr w:type="gramStart"/>
       <w:r>
         <w:rPr>
           <w:b/>
@@ -1701,27 +1698,8 @@
           <w:bCs/>
           <w:lang w:val="en-US"/>
         </w:rPr>
-        <w:t xml:space="preserve"> install @</w:t>
-      </w:r>
-      <w:proofErr w:type="gramEnd"/>
-      <w:r>
-        <w:rPr>
-          <w:b/>
-          <w:bCs/>
-          <w:lang w:val="en-US"/>
-        </w:rPr>
-        <w:t xml:space="preserve">nestjs/mongoose </w:t>
-      </w:r>
-      <w:proofErr w:type="gramStart"/>
-      <w:r>
-        <w:rPr>
-          <w:b/>
-          <w:bCs/>
-          <w:lang w:val="en-US"/>
-        </w:rPr>
-        <w:t>mongoose</w:t>
-      </w:r>
-      <w:proofErr w:type="gramEnd"/>
+        <w:t xml:space="preserve"> install @nestjs/mongoose mongoose</w:t>
+      </w:r>
     </w:p>
     <w:p>
       <w:pPr>
@@ -1735,6 +1713,7 @@
         <w:rPr>
           <w:b/>
           <w:bCs/>
+          <w:noProof/>
         </w:rPr>
         <w:lastRenderedPageBreak/>
         <w:drawing>
@@ -1844,7 +1823,6 @@
         <w:t xml:space="preserve"> run </w:t>
       </w:r>
       <w:proofErr w:type="spellStart"/>
-      <w:proofErr w:type="gramStart"/>
       <w:r>
         <w:rPr>
           <w:b/>
@@ -1853,10 +1831,12 @@
         <w:t>start:dev</w:t>
       </w:r>
       <w:proofErr w:type="spellEnd"/>
-      <w:proofErr w:type="gramEnd"/>
     </w:p>
     <w:p>
       <w:r>
+        <w:rPr>
+          <w:noProof/>
+        </w:rPr>
         <w:drawing>
           <wp:inline distT="0" distB="0" distL="0" distR="0" wp14:anchorId="1A8ED557" wp14:editId="749B2858">
             <wp:extent cx="5125165" cy="800212"/>
@@ -1896,6 +1876,9 @@
     </w:p>
     <w:p>
       <w:r>
+        <w:rPr>
+          <w:noProof/>
+        </w:rPr>
         <w:drawing>
           <wp:inline distT="0" distB="0" distL="0" distR="0" wp14:anchorId="118FC269" wp14:editId="2D6F6A94">
             <wp:extent cx="5612130" cy="1865630"/>
@@ -2080,6 +2063,113 @@
       </w:r>
       <w:proofErr w:type="spellEnd"/>
     </w:p>
+    <w:p>
+      <w:pPr>
+        <w:rPr>
+          <w:b/>
+          <w:bCs/>
+        </w:rPr>
+      </w:pPr>
+      <w:r>
+        <w:rPr>
+          <w:b/>
+          <w:bCs/>
+        </w:rPr>
+        <w:lastRenderedPageBreak/>
+        <w:drawing>
+          <wp:inline distT="0" distB="0" distL="0" distR="0" wp14:anchorId="18DA2FED" wp14:editId="37C7BD67">
+            <wp:extent cx="5150417" cy="2124075"/>
+            <wp:effectExtent l="0" t="0" r="0" b="0"/>
+            <wp:docPr id="1875642265" name="Imagen 1"/>
+            <wp:cNvGraphicFramePr>
+              <a:graphicFrameLocks xmlns:a="http://schemas.openxmlformats.org/drawingml/2006/main" noChangeAspect="1"/>
+            </wp:cNvGraphicFramePr>
+            <a:graphic xmlns:a="http://schemas.openxmlformats.org/drawingml/2006/main">
+              <a:graphicData uri="http://schemas.openxmlformats.org/drawingml/2006/picture">
+                <pic:pic xmlns:pic="http://schemas.openxmlformats.org/drawingml/2006/picture">
+                  <pic:nvPicPr>
+                    <pic:cNvPr id="1875642265" name=""/>
+                    <pic:cNvPicPr/>
+                  </pic:nvPicPr>
+                  <pic:blipFill>
+                    <a:blip r:embed="rId14"/>
+                    <a:stretch>
+                      <a:fillRect/>
+                    </a:stretch>
+                  </pic:blipFill>
+                  <pic:spPr>
+                    <a:xfrm>
+                      <a:off x="0" y="0"/>
+                      <a:ext cx="5158896" cy="2127572"/>
+                    </a:xfrm>
+                    <a:prstGeom prst="rect">
+                      <a:avLst/>
+                    </a:prstGeom>
+                  </pic:spPr>
+                </pic:pic>
+              </a:graphicData>
+            </a:graphic>
+          </wp:inline>
+        </w:drawing>
+      </w:r>
+    </w:p>
+    <w:p>
+      <w:r>
+        <w:t>Podemos ver que nos instalan las carpetas principales</w:t>
+      </w:r>
+    </w:p>
+    <w:p>
+      <w:pPr>
+        <w:jc w:val="center"/>
+      </w:pPr>
+      <w:r>
+        <w:drawing>
+          <wp:inline distT="0" distB="0" distL="0" distR="0" wp14:anchorId="0E71DC01" wp14:editId="4111C3F7">
+            <wp:extent cx="2753109" cy="2314898"/>
+            <wp:effectExtent l="0" t="0" r="9525" b="9525"/>
+            <wp:docPr id="1502941490" name="Imagen 1"/>
+            <wp:cNvGraphicFramePr>
+              <a:graphicFrameLocks xmlns:a="http://schemas.openxmlformats.org/drawingml/2006/main" noChangeAspect="1"/>
+            </wp:cNvGraphicFramePr>
+            <a:graphic xmlns:a="http://schemas.openxmlformats.org/drawingml/2006/main">
+              <a:graphicData uri="http://schemas.openxmlformats.org/drawingml/2006/picture">
+                <pic:pic xmlns:pic="http://schemas.openxmlformats.org/drawingml/2006/picture">
+                  <pic:nvPicPr>
+                    <pic:cNvPr id="1502941490" name=""/>
+                    <pic:cNvPicPr/>
+                  </pic:nvPicPr>
+                  <pic:blipFill>
+                    <a:blip r:embed="rId15"/>
+                    <a:stretch>
+                      <a:fillRect/>
+                    </a:stretch>
+                  </pic:blipFill>
+                  <pic:spPr>
+                    <a:xfrm>
+                      <a:off x="0" y="0"/>
+                      <a:ext cx="2753109" cy="2314898"/>
+                    </a:xfrm>
+                    <a:prstGeom prst="rect">
+                      <a:avLst/>
+                    </a:prstGeom>
+                  </pic:spPr>
+                </pic:pic>
+              </a:graphicData>
+            </a:graphic>
+          </wp:inline>
+        </w:drawing>
+      </w:r>
+    </w:p>
+    <w:p>
+      <w:r>
+        <w:t>Y así sucesivamente con cada entidad</w:t>
+      </w:r>
+      <w:r>
+        <w:t>.</w:t>
+      </w:r>
+    </w:p>
+    <w:p/>
+    <w:p/>
     <w:p>
       <w:pPr>
         <w:rPr>
@@ -2722,6 +2812,7 @@
   <w:style w:type="character" w:default="1" w:styleId="Fuentedeprrafopredeter">
     <w:name w:val="Default Paragraph Font"/>
     <w:uiPriority w:val="1"/>
+    <w:semiHidden/>
     <w:unhideWhenUsed/>
   </w:style>
   <w:style w:type="table" w:default="1" w:styleId="Tablanormal">
@@ -3454,21 +3545,6 @@
 </file>
 
 <file path=customXml/item1.xml><?xml version="1.0" encoding="utf-8"?>
-<?mso-contentType ?>
-<FormTemplates xmlns="http://schemas.microsoft.com/sharepoint/v3/contenttype/forms">
-  <Display>DocumentLibraryForm</Display>
-  <Edit>DocumentLibraryForm</Edit>
-  <New>DocumentLibraryForm</New>
-</FormTemplates>
-</file>
-
-<file path=customXml/item2.xml><?xml version="1.0" encoding="utf-8"?>
-<p:properties xmlns:p="http://schemas.microsoft.com/office/2006/metadata/properties" xmlns:xsi="http://www.w3.org/2001/XMLSchema-instance" xmlns:pc="http://schemas.microsoft.com/office/infopath/2007/PartnerControls">
-  <documentManagement/>
-</p:properties>
-</file>
-
-<file path=customXml/item3.xml><?xml version="1.0" encoding="utf-8"?>
 <ct:contentTypeSchema xmlns:ct="http://schemas.microsoft.com/office/2006/metadata/contentType" xmlns:ma="http://schemas.microsoft.com/office/2006/metadata/properties/metaAttributes" ct:_="" ma:_="" ma:contentTypeName="Documento" ma:contentTypeID="0x01010098CE1D78FC632245B029FFE67C3A52E9" ma:contentTypeVersion="4" ma:contentTypeDescription="Crear nuevo documento." ma:contentTypeScope="" ma:versionID="444c84c3a83ceb57daf834ab012e2b6a">
   <xsd:schema xmlns:xsd="http://www.w3.org/2001/XMLSchema" xmlns:xs="http://www.w3.org/2001/XMLSchema" xmlns:p="http://schemas.microsoft.com/office/2006/metadata/properties" xmlns:ns3="0d319e56-4211-4e52-83f0-58f49797989a" targetNamespace="http://schemas.microsoft.com/office/2006/metadata/properties" ma:root="true" ma:fieldsID="ee5c279b902e44cfc2c3f89c2ebaaa7e" ns3:_="">
     <xsd:import namespace="0d319e56-4211-4e52-83f0-58f49797989a"/>
@@ -3612,24 +3688,22 @@
 </ct:contentTypeSchema>
 </file>
 
-<file path=customXml/itemProps1.xml><?xml version="1.0" encoding="utf-8"?>
-<ds:datastoreItem xmlns:ds="http://schemas.openxmlformats.org/officeDocument/2006/customXml" ds:itemID="{2B93DEC2-8C80-4466-A26F-F7157091F69A}">
-  <ds:schemaRefs>
-    <ds:schemaRef ds:uri="http://schemas.microsoft.com/sharepoint/v3/contenttype/forms"/>
-  </ds:schemaRefs>
-</ds:datastoreItem>
+<file path=customXml/item2.xml><?xml version="1.0" encoding="utf-8"?>
+<p:properties xmlns:p="http://schemas.microsoft.com/office/2006/metadata/properties" xmlns:xsi="http://www.w3.org/2001/XMLSchema-instance" xmlns:pc="http://schemas.microsoft.com/office/infopath/2007/PartnerControls">
+  <documentManagement/>
+</p:properties>
 </file>
 
-<file path=customXml/itemProps2.xml><?xml version="1.0" encoding="utf-8"?>
-<ds:datastoreItem xmlns:ds="http://schemas.openxmlformats.org/officeDocument/2006/customXml" ds:itemID="{86806066-58CC-48AB-9171-94BA2726B27E}">
-  <ds:schemaRefs>
-    <ds:schemaRef ds:uri="http://schemas.microsoft.com/office/2006/metadata/properties"/>
-    <ds:schemaRef ds:uri="http://schemas.microsoft.com/office/infopath/2007/PartnerControls"/>
-  </ds:schemaRefs>
-</ds:datastoreItem>
+<file path=customXml/item3.xml><?xml version="1.0" encoding="utf-8"?>
+<?mso-contentType ?>
+<FormTemplates xmlns="http://schemas.microsoft.com/sharepoint/v3/contenttype/forms">
+  <Display>DocumentLibraryForm</Display>
+  <Edit>DocumentLibraryForm</Edit>
+  <New>DocumentLibraryForm</New>
+</FormTemplates>
 </file>
 
-<file path=customXml/itemProps3.xml><?xml version="1.0" encoding="utf-8"?>
+<file path=customXml/itemProps1.xml><?xml version="1.0" encoding="utf-8"?>
 <ds:datastoreItem xmlns:ds="http://schemas.openxmlformats.org/officeDocument/2006/customXml" ds:itemID="{0F445897-B7EA-44D2-BA92-6628C256B229}">
   <ds:schemaRefs>
     <ds:schemaRef ds:uri="http://schemas.microsoft.com/office/2006/metadata/contentType"/>
@@ -3645,4 +3719,21 @@
     <ds:schemaRef ds:uri="http://schemas.microsoft.com/internal/obd"/>
   </ds:schemaRefs>
 </ds:datastoreItem>
+</file>
+
+<file path=customXml/itemProps2.xml><?xml version="1.0" encoding="utf-8"?>
+<ds:datastoreItem xmlns:ds="http://schemas.openxmlformats.org/officeDocument/2006/customXml" ds:itemID="{86806066-58CC-48AB-9171-94BA2726B27E}">
+  <ds:schemaRefs>
+    <ds:schemaRef ds:uri="http://schemas.microsoft.com/office/2006/metadata/properties"/>
+    <ds:schemaRef ds:uri="http://schemas.microsoft.com/office/infopath/2007/PartnerControls"/>
+  </ds:schemaRefs>
+</ds:datastoreItem>
+</file>
+
+<file path=customXml/itemProps3.xml><?xml version="1.0" encoding="utf-8"?>
+<ds:datastoreItem xmlns:ds="http://schemas.openxmlformats.org/officeDocument/2006/customXml" ds:itemID="{2B93DEC2-8C80-4466-A26F-F7157091F69A}">
+  <ds:schemaRefs>
+    <ds:schemaRef ds:uri="http://schemas.microsoft.com/sharepoint/v3/contenttype/forms"/>
+  </ds:schemaRefs>
+</ds:datastoreItem>
 </file>
</xml_diff>

<commit_message>
FW-07 | Type Feat:  Add monthly-incomes module with CRUD.
</commit_message>
<xml_diff>
--- a/Documentation FinWise.docx
+++ b/Documentation FinWise.docx
@@ -220,7 +220,7 @@
                                 <a:avLst/>
                               </a:prstGeom>
                               <a:blipFill>
-                                <a:blip r:embed="rId7"/>
+                                <a:blip r:embed="rId8"/>
                                 <a:stretch>
                                   <a:fillRect r="-7574"/>
                                 </a:stretch>
@@ -272,7 +272,7 @@
                       <v:path arrowok="t" o:connecttype="custom" o:connectlocs="0,0;7315200,0;7315200,1130373;3620757,733885;0,1092249;0,0" o:connectangles="0,0,0,0,0,0"/>
                     </v:shape>
                     <v:rect id="Rectángulo 151" o:spid="_x0000_s1028" style="position:absolute;width:73152;height:12161;visibility:visible;mso-wrap-style:square;v-text-anchor:middle" o:gfxdata="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" stroked="f" strokeweight="1.5pt">
-                      <v:fill r:id="rId8" o:title="" recolor="t" rotate="t" type="frame"/>
+                      <v:fill r:id="rId9" o:title="" recolor="t" rotate="t" type="frame"/>
                     </v:rect>
                     <w10:wrap anchorx="page" anchory="page"/>
                   </v:group>
@@ -1351,69 +1351,28 @@
     </w:p>
     <w:p>
       <w:r>
-        <w:t xml:space="preserve">El proyecto </w:t>
-      </w:r>
-      <w:proofErr w:type="spellStart"/>
-      <w:r>
-        <w:t>backend</w:t>
-      </w:r>
-      <w:proofErr w:type="spellEnd"/>
-      <w:r>
-        <w:t xml:space="preserve"> es con </w:t>
-      </w:r>
-      <w:proofErr w:type="spellStart"/>
-      <w:r>
-        <w:t>nestJS</w:t>
-      </w:r>
-      <w:proofErr w:type="spellEnd"/>
-      <w:r>
-        <w:t xml:space="preserve"> , </w:t>
+        <w:t xml:space="preserve">El proyecto backend es con nestJS , </w:t>
       </w:r>
       <w:r>
         <w:t>primeramente,</w:t>
       </w:r>
       <w:r>
-        <w:t xml:space="preserve"> después de clonar el repositorio </w:t>
-      </w:r>
-      <w:proofErr w:type="spellStart"/>
-      <w:r>
-        <w:t>backend</w:t>
-      </w:r>
-      <w:proofErr w:type="spellEnd"/>
-      <w:r>
-        <w:t xml:space="preserve"> instalamos el </w:t>
-      </w:r>
-      <w:proofErr w:type="spellStart"/>
-      <w:r>
-        <w:t>nestjs</w:t>
-      </w:r>
-      <w:proofErr w:type="spellEnd"/>
-      <w:r>
-        <w:t>:</w:t>
-      </w:r>
-    </w:p>
-    <w:p>
-      <w:pPr>
-        <w:rPr>
-          <w:b/>
-          <w:bCs/>
-        </w:rPr>
-      </w:pPr>
-      <w:proofErr w:type="spellStart"/>
-      <w:r>
-        <w:rPr>
-          <w:b/>
-          <w:bCs/>
-        </w:rPr>
-        <w:t>npm</w:t>
-      </w:r>
-      <w:proofErr w:type="spellEnd"/>
-      <w:r>
-        <w:rPr>
-          <w:b/>
-          <w:bCs/>
-        </w:rPr>
-        <w:t xml:space="preserve"> i -g @nestjs/cli</w:t>
+        <w:t xml:space="preserve"> después de clonar el repositorio backend instalamos el nestjs:</w:t>
+      </w:r>
+    </w:p>
+    <w:p>
+      <w:pPr>
+        <w:rPr>
+          <w:b/>
+          <w:bCs/>
+        </w:rPr>
+      </w:pPr>
+      <w:r>
+        <w:rPr>
+          <w:b/>
+          <w:bCs/>
+        </w:rPr>
+        <w:t>npm i -g @nestjs/cli</w:t>
       </w:r>
     </w:p>
     <w:p>
@@ -1445,7 +1404,7 @@
                     <pic:cNvPicPr/>
                   </pic:nvPicPr>
                   <pic:blipFill>
-                    <a:blip r:embed="rId9"/>
+                    <a:blip r:embed="rId10"/>
                     <a:stretch>
                       <a:fillRect/>
                     </a:stretch>
@@ -1478,31 +1437,13 @@
           <w:bCs/>
         </w:rPr>
       </w:pPr>
-      <w:proofErr w:type="spellStart"/>
-      <w:r>
-        <w:rPr>
-          <w:b/>
-          <w:bCs/>
-        </w:rPr>
-        <w:t>nest</w:t>
-      </w:r>
-      <w:proofErr w:type="spellEnd"/>
-      <w:r>
-        <w:rPr>
-          <w:b/>
-          <w:bCs/>
-        </w:rPr>
-        <w:t xml:space="preserve"> --</w:t>
-      </w:r>
-      <w:proofErr w:type="spellStart"/>
-      <w:r>
-        <w:rPr>
-          <w:b/>
-          <w:bCs/>
-        </w:rPr>
-        <w:t>version</w:t>
-      </w:r>
-      <w:proofErr w:type="spellEnd"/>
+      <w:r>
+        <w:rPr>
+          <w:b/>
+          <w:bCs/>
+        </w:rPr>
+        <w:t>nest --version</w:t>
+      </w:r>
     </w:p>
     <w:p>
       <w:r>
@@ -1525,7 +1466,7 @@
                     <pic:cNvPicPr/>
                   </pic:nvPicPr>
                   <pic:blipFill>
-                    <a:blip r:embed="rId10"/>
+                    <a:blip r:embed="rId11"/>
                     <a:stretch>
                       <a:fillRect/>
                     </a:stretch>
@@ -1574,65 +1515,23 @@
           <w:bCs/>
         </w:rPr>
       </w:pPr>
-      <w:proofErr w:type="spellStart"/>
-      <w:r>
-        <w:rPr>
-          <w:b/>
-          <w:bCs/>
-        </w:rPr>
-        <w:t>nest</w:t>
-      </w:r>
-      <w:proofErr w:type="spellEnd"/>
-      <w:r>
-        <w:rPr>
-          <w:b/>
-          <w:bCs/>
-        </w:rPr>
-        <w:t xml:space="preserve"> new </w:t>
-      </w:r>
-      <w:proofErr w:type="spellStart"/>
-      <w:r>
-        <w:rPr>
-          <w:b/>
-          <w:bCs/>
-        </w:rPr>
-        <w:t>finwise-backend</w:t>
-      </w:r>
-      <w:proofErr w:type="spellEnd"/>
-    </w:p>
-    <w:p>
-      <w:r>
-        <w:t>Te preguntará qué gestor de paquetes prefieres (</w:t>
-      </w:r>
-      <w:proofErr w:type="spellStart"/>
-      <w:r>
-        <w:t>npm</w:t>
-      </w:r>
-      <w:proofErr w:type="spellEnd"/>
-      <w:r>
-        <w:t xml:space="preserve"> o </w:t>
-      </w:r>
-      <w:proofErr w:type="spellStart"/>
-      <w:r>
-        <w:t>yarn</w:t>
-      </w:r>
-      <w:proofErr w:type="spellEnd"/>
-      <w:r>
-        <w:t>). El</w:t>
+      <w:r>
+        <w:rPr>
+          <w:b/>
+          <w:bCs/>
+        </w:rPr>
+        <w:t>nest new finwise-backend</w:t>
+      </w:r>
+    </w:p>
+    <w:p>
+      <w:r>
+        <w:t>Te preguntará qué gestor de paquetes prefieres (npm o yarn). El</w:t>
       </w:r>
       <w:r>
         <w:t>egir</w:t>
       </w:r>
       <w:r>
-        <w:t xml:space="preserve"> </w:t>
-      </w:r>
-      <w:proofErr w:type="spellStart"/>
-      <w:r>
-        <w:t>npm</w:t>
-      </w:r>
-      <w:proofErr w:type="spellEnd"/>
-      <w:r>
-        <w:t xml:space="preserve"> (es el más común).</w:t>
+        <w:t xml:space="preserve"> npm (es el más común).</w:t>
       </w:r>
     </w:p>
     <w:p>
@@ -1646,15 +1545,7 @@
       </w:pPr>
       <w:bookmarkStart w:id="2" w:name="_Toc235089154"/>
       <w:r>
-        <w:t xml:space="preserve">Instalar Dependencias de </w:t>
-      </w:r>
-      <w:proofErr w:type="spellStart"/>
-      <w:r>
-        <w:t>Mongoose</w:t>
-      </w:r>
-      <w:proofErr w:type="spellEnd"/>
-      <w:r>
-        <w:t xml:space="preserve"> para Manejo con MongoDB</w:t>
+        <w:t>Instalar Dependencias de Mongoose para Manejo con MongoDB</w:t>
       </w:r>
       <w:bookmarkEnd w:id="2"/>
     </w:p>
@@ -1663,15 +1554,7 @@
         <w:t>Es importante la descarga d</w:t>
       </w:r>
       <w:r>
-        <w:t xml:space="preserve">e estas dependencias para permitir la conexión con </w:t>
-      </w:r>
-      <w:proofErr w:type="spellStart"/>
-      <w:r>
-        <w:t>mongoDB</w:t>
-      </w:r>
-      <w:proofErr w:type="spellEnd"/>
-      <w:r>
-        <w:t>.</w:t>
+        <w:t>e estas dependencias para permitir la conexión con mongoDB.</w:t>
       </w:r>
     </w:p>
     <w:p>
@@ -1682,23 +1565,13 @@
           <w:lang w:val="en-US"/>
         </w:rPr>
       </w:pPr>
-      <w:proofErr w:type="spellStart"/>
       <w:r>
         <w:rPr>
           <w:b/>
           <w:bCs/>
           <w:lang w:val="en-US"/>
         </w:rPr>
-        <w:t>npm</w:t>
-      </w:r>
-      <w:proofErr w:type="spellEnd"/>
-      <w:r>
-        <w:rPr>
-          <w:b/>
-          <w:bCs/>
-          <w:lang w:val="en-US"/>
-        </w:rPr>
-        <w:t xml:space="preserve"> install @nestjs/mongoose mongoose</w:t>
+        <w:t>npm install @nestjs/mongoose mongoose</w:t>
       </w:r>
     </w:p>
     <w:p>
@@ -1732,7 +1605,7 @@
                     <pic:cNvPicPr/>
                   </pic:nvPicPr>
                   <pic:blipFill>
-                    <a:blip r:embed="rId11"/>
+                    <a:blip r:embed="rId12"/>
                     <a:stretch>
                       <a:fillRect/>
                     </a:stretch>
@@ -1775,23 +1648,7 @@
           <w:b/>
           <w:bCs/>
         </w:rPr>
-        <w:t xml:space="preserve">Comando </w:t>
-      </w:r>
-      <w:proofErr w:type="spellStart"/>
-      <w:r>
-        <w:rPr>
-          <w:b/>
-          <w:bCs/>
-        </w:rPr>
-        <w:t>NestJS</w:t>
-      </w:r>
-      <w:proofErr w:type="spellEnd"/>
-      <w:r>
-        <w:rPr>
-          <w:b/>
-          <w:bCs/>
-        </w:rPr>
-        <w:t xml:space="preserve"> para Arrancar</w:t>
+        <w:t>Comando NestJS para Arrancar</w:t>
       </w:r>
     </w:p>
     <w:p>
@@ -1806,31 +1663,13 @@
           <w:bCs/>
         </w:rPr>
       </w:pPr>
-      <w:proofErr w:type="spellStart"/>
-      <w:r>
-        <w:rPr>
-          <w:b/>
-          <w:bCs/>
-        </w:rPr>
-        <w:t>npm</w:t>
-      </w:r>
-      <w:proofErr w:type="spellEnd"/>
-      <w:r>
-        <w:rPr>
-          <w:b/>
-          <w:bCs/>
-        </w:rPr>
-        <w:t xml:space="preserve"> run </w:t>
-      </w:r>
-      <w:proofErr w:type="spellStart"/>
-      <w:r>
-        <w:rPr>
-          <w:b/>
-          <w:bCs/>
-        </w:rPr>
-        <w:t>start:dev</w:t>
-      </w:r>
-      <w:proofErr w:type="spellEnd"/>
+      <w:r>
+        <w:rPr>
+          <w:b/>
+          <w:bCs/>
+        </w:rPr>
+        <w:t>npm run start:dev</w:t>
+      </w:r>
     </w:p>
     <w:p>
       <w:r>
@@ -1853,7 +1692,7 @@
                     <pic:cNvPicPr/>
                   </pic:nvPicPr>
                   <pic:blipFill>
-                    <a:blip r:embed="rId12"/>
+                    <a:blip r:embed="rId13"/>
                     <a:stretch>
                       <a:fillRect/>
                     </a:stretch>
@@ -1895,7 +1734,7 @@
                     <pic:cNvPicPr/>
                   </pic:nvPicPr>
                   <pic:blipFill>
-                    <a:blip r:embed="rId13"/>
+                    <a:blip r:embed="rId14"/>
                     <a:stretch>
                       <a:fillRect/>
                     </a:stretch>
@@ -2004,13 +1843,27 @@
       </w:r>
     </w:p>
     <w:p>
+      <w:pPr>
+        <w:rPr>
+          <w:lang w:val="en-US"/>
+        </w:rPr>
+      </w:pPr>
       <w:r>
         <w:t>Para generar esta carpeta de cada entidad damos el comando</w:t>
       </w:r>
       <w:r>
-        <w:t>. Ejemplo</w:t>
-      </w:r>
-      <w:r>
+        <w:t xml:space="preserve">. </w:t>
+      </w:r>
+      <w:r>
+        <w:rPr>
+          <w:lang w:val="en-US"/>
+        </w:rPr>
+        <w:t>Ejemplo</w:t>
+      </w:r>
+      <w:r>
+        <w:rPr>
+          <w:lang w:val="en-US"/>
+        </w:rPr>
         <w:t>:</w:t>
       </w:r>
     </w:p>
@@ -2019,61 +1872,30 @@
         <w:rPr>
           <w:b/>
           <w:bCs/>
-        </w:rPr>
-      </w:pPr>
-      <w:proofErr w:type="spellStart"/>
-      <w:r>
-        <w:rPr>
-          <w:b/>
-          <w:bCs/>
-        </w:rPr>
-        <w:t>nest</w:t>
-      </w:r>
-      <w:proofErr w:type="spellEnd"/>
-      <w:r>
-        <w:rPr>
-          <w:b/>
-          <w:bCs/>
-        </w:rPr>
-        <w:t xml:space="preserve"> g </w:t>
-      </w:r>
-      <w:proofErr w:type="spellStart"/>
-      <w:r>
-        <w:rPr>
-          <w:b/>
-          <w:bCs/>
-        </w:rPr>
-        <w:t>resource</w:t>
-      </w:r>
-      <w:proofErr w:type="spellEnd"/>
-      <w:r>
-        <w:rPr>
-          <w:b/>
-          <w:bCs/>
-        </w:rPr>
-        <w:t xml:space="preserve"> </w:t>
-      </w:r>
-      <w:proofErr w:type="spellStart"/>
-      <w:r>
-        <w:rPr>
-          <w:b/>
-          <w:bCs/>
-        </w:rPr>
-        <w:t>monthly-incomes</w:t>
-      </w:r>
-      <w:proofErr w:type="spellEnd"/>
-    </w:p>
-    <w:p>
-      <w:pPr>
-        <w:rPr>
-          <w:b/>
-          <w:bCs/>
-        </w:rPr>
-      </w:pPr>
-      <w:r>
-        <w:rPr>
-          <w:b/>
-          <w:bCs/>
+          <w:lang w:val="en-US"/>
+        </w:rPr>
+      </w:pPr>
+      <w:r>
+        <w:rPr>
+          <w:b/>
+          <w:bCs/>
+          <w:lang w:val="en-US"/>
+        </w:rPr>
+        <w:t>nest g resource monthly-incomes</w:t>
+      </w:r>
+    </w:p>
+    <w:p>
+      <w:pPr>
+        <w:rPr>
+          <w:b/>
+          <w:bCs/>
+        </w:rPr>
+      </w:pPr>
+      <w:r>
+        <w:rPr>
+          <w:b/>
+          <w:bCs/>
+          <w:noProof/>
         </w:rPr>
         <w:lastRenderedPageBreak/>
         <w:drawing>
@@ -2092,7 +1914,7 @@
                     <pic:cNvPicPr/>
                   </pic:nvPicPr>
                   <pic:blipFill>
-                    <a:blip r:embed="rId14"/>
+                    <a:blip r:embed="rId15"/>
                     <a:stretch>
                       <a:fillRect/>
                     </a:stretch>
@@ -2123,6 +1945,9 @@
         <w:jc w:val="center"/>
       </w:pPr>
       <w:r>
+        <w:rPr>
+          <w:noProof/>
+        </w:rPr>
         <w:drawing>
           <wp:inline distT="0" distB="0" distL="0" distR="0" wp14:anchorId="0E71DC01" wp14:editId="4111C3F7">
             <wp:extent cx="2753109" cy="2314898"/>
@@ -2139,7 +1964,7 @@
                     <pic:cNvPicPr/>
                   </pic:nvPicPr>
                   <pic:blipFill>
-                    <a:blip r:embed="rId15"/>
+                    <a:blip r:embed="rId16"/>
                     <a:stretch>
                       <a:fillRect/>
                     </a:stretch>
@@ -2169,6 +1994,244 @@
       </w:r>
     </w:p>
     <w:p/>
+    <w:p>
+      <w:pPr>
+        <w:pStyle w:val="Ttulo2"/>
+        <w:rPr>
+          <w:b/>
+          <w:bCs/>
+        </w:rPr>
+      </w:pPr>
+      <w:r>
+        <w:rPr>
+          <w:b/>
+          <w:bCs/>
+        </w:rPr>
+        <w:t>Dependencias Adicionales</w:t>
+      </w:r>
+    </w:p>
+    <w:p>
+      <w:pPr>
+        <w:pStyle w:val="Ttulo3"/>
+      </w:pPr>
+      <w:r>
+        <w:t>DTOs</w:t>
+      </w:r>
+    </w:p>
+    <w:p>
+      <w:r>
+        <w:rPr>
+          <w:b/>
+          <w:bCs/>
+        </w:rPr>
+        <w:t>DTOs</w:t>
+      </w:r>
+      <w:r>
+        <w:t> definen la estructura de los datos que esperamos en la petición. Podemos agregar validaciones con </w:t>
+      </w:r>
+      <w:r>
+        <w:rPr>
+          <w:b/>
+          <w:bCs/>
+        </w:rPr>
+        <w:t>class-validator</w:t>
+      </w:r>
+      <w:r>
+        <w:t> (opcional).</w:t>
+      </w:r>
+    </w:p>
+    <w:p>
+      <w:r>
+        <w:rPr>
+          <w:b/>
+          <w:bCs/>
+        </w:rPr>
+        <w:t>Nota:</w:t>
+      </w:r>
+      <w:r>
+        <w:t xml:space="preserve"> Para usar class-validator, </w:t>
+      </w:r>
+      <w:r>
+        <w:t xml:space="preserve">se </w:t>
+      </w:r>
+      <w:r>
+        <w:t>instala la dependencia:</w:t>
+      </w:r>
+    </w:p>
+    <w:p>
+      <w:pPr>
+        <w:rPr>
+          <w:b/>
+          <w:bCs/>
+          <w:lang w:val="en-US"/>
+        </w:rPr>
+      </w:pPr>
+      <w:r>
+        <w:rPr>
+          <w:b/>
+          <w:bCs/>
+          <w:lang w:val="en-US"/>
+        </w:rPr>
+        <w:t>npm install class-validator class-transformer</w:t>
+      </w:r>
+    </w:p>
+    <w:p>
+      <w:pPr>
+        <w:rPr>
+          <w:b/>
+          <w:bCs/>
+          <w:lang w:val="en-US"/>
+        </w:rPr>
+      </w:pPr>
+      <w:r>
+        <w:rPr>
+          <w:b/>
+          <w:bCs/>
+          <w:lang w:val="en-US"/>
+        </w:rPr>
+        <w:lastRenderedPageBreak/>
+        <w:drawing>
+          <wp:inline distT="0" distB="0" distL="0" distR="0" wp14:anchorId="3FCFC125" wp14:editId="20317745">
+            <wp:extent cx="5258534" cy="952633"/>
+            <wp:effectExtent l="0" t="0" r="0" b="0"/>
+            <wp:docPr id="2077903215" name="Imagen 1"/>
+            <wp:cNvGraphicFramePr>
+              <a:graphicFrameLocks xmlns:a="http://schemas.openxmlformats.org/drawingml/2006/main" noChangeAspect="1"/>
+            </wp:cNvGraphicFramePr>
+            <a:graphic xmlns:a="http://schemas.openxmlformats.org/drawingml/2006/main">
+              <a:graphicData uri="http://schemas.openxmlformats.org/drawingml/2006/picture">
+                <pic:pic xmlns:pic="http://schemas.openxmlformats.org/drawingml/2006/picture">
+                  <pic:nvPicPr>
+                    <pic:cNvPr id="2077903215" name=""/>
+                    <pic:cNvPicPr/>
+                  </pic:nvPicPr>
+                  <pic:blipFill>
+                    <a:blip r:embed="rId17"/>
+                    <a:stretch>
+                      <a:fillRect/>
+                    </a:stretch>
+                  </pic:blipFill>
+                  <pic:spPr>
+                    <a:xfrm>
+                      <a:off x="0" y="0"/>
+                      <a:ext cx="5258534" cy="952633"/>
+                    </a:xfrm>
+                    <a:prstGeom prst="rect">
+                      <a:avLst/>
+                    </a:prstGeom>
+                  </pic:spPr>
+                </pic:pic>
+              </a:graphicData>
+            </a:graphic>
+          </wp:inline>
+        </w:drawing>
+      </w:r>
+    </w:p>
+    <w:p>
+      <w:pPr>
+        <w:rPr>
+          <w:lang w:val="en-US"/>
+        </w:rPr>
+      </w:pPr>
+    </w:p>
+    <w:p>
+      <w:pPr>
+        <w:rPr>
+          <w:lang w:val="en-US"/>
+        </w:rPr>
+      </w:pPr>
+    </w:p>
+    <w:p>
+      <w:pPr>
+        <w:rPr>
+          <w:lang w:val="en-US"/>
+        </w:rPr>
+      </w:pPr>
+    </w:p>
+    <w:p>
+      <w:pPr>
+        <w:rPr>
+          <w:lang w:val="en-US"/>
+        </w:rPr>
+      </w:pPr>
+    </w:p>
+    <w:p>
+      <w:pPr>
+        <w:rPr>
+          <w:lang w:val="en-US"/>
+        </w:rPr>
+      </w:pPr>
+    </w:p>
+    <w:p>
+      <w:pPr>
+        <w:rPr>
+          <w:lang w:val="en-US"/>
+        </w:rPr>
+      </w:pPr>
+    </w:p>
+    <w:p>
+      <w:r>
+        <w:t>PASOS A SEGUIR:</w:t>
+      </w:r>
+    </w:p>
+    <w:p>
+      <w:pPr>
+        <w:rPr>
+          <w:b/>
+          <w:bCs/>
+        </w:rPr>
+      </w:pPr>
+      <w:r>
+        <w:rPr>
+          <w:rFonts w:ascii="Segoe UI Emoji" w:hAnsi="Segoe UI Emoji" w:cs="Segoe UI Emoji"/>
+          <w:b/>
+          <w:bCs/>
+        </w:rPr>
+        <w:t>🧠</w:t>
+      </w:r>
+      <w:r>
+        <w:rPr>
+          <w:b/>
+          <w:bCs/>
+        </w:rPr>
+        <w:t xml:space="preserve"> Siguientes pasos (después de esto)</w:t>
+      </w:r>
+    </w:p>
+    <w:p>
+      <w:pPr>
+        <w:numPr>
+          <w:ilvl w:val="0"/>
+          <w:numId w:val="1"/>
+        </w:numPr>
+      </w:pPr>
+      <w:r>
+        <w:t>Implementar lógica de negocio (calcular restante del sueldo, actualizar remaining_amount de deudas al hacer pagos, acumular current_amount en ahorros).</w:t>
+      </w:r>
+    </w:p>
+    <w:p>
+      <w:pPr>
+        <w:numPr>
+          <w:ilvl w:val="0"/>
+          <w:numId w:val="1"/>
+        </w:numPr>
+      </w:pPr>
+      <w:r>
+        <w:t>Agregar autenticación con JWT y Google OAuth.</w:t>
+      </w:r>
+    </w:p>
+    <w:p>
+      <w:pPr>
+        <w:numPr>
+          <w:ilvl w:val="0"/>
+          <w:numId w:val="1"/>
+        </w:numPr>
+      </w:pPr>
+      <w:r>
+        <w:t>Crear el frontend en Angular.</w:t>
+      </w:r>
+    </w:p>
+    <w:p/>
+    <w:p/>
     <w:p/>
     <w:p>
       <w:pPr>
@@ -2209,6 +2272,163 @@
     </w:sectPr>
   </w:body>
 </w:document>
+</file>
+
+<file path=word/numbering.xml><?xml version="1.0" encoding="utf-8"?>
+<w:numbering xmlns:wpc="http://schemas.microsoft.com/office/word/2010/wordprocessingCanvas" xmlns:cx="http://schemas.microsoft.com/office/drawing/2014/chartex" xmlns:cx1="http://schemas.microsoft.com/office/drawing/2015/9/8/chartex" xmlns:cx2="http://schemas.microsoft.com/office/drawing/2015/10/21/chartex" xmlns:cx3="http://schemas.microsoft.com/office/drawing/2016/5/9/chartex" xmlns:cx4="http://schemas.microsoft.com/office/drawing/2016/5/10/chartex" xmlns:cx5="http://schemas.microsoft.com/office/drawing/2016/5/11/chartex" xmlns:cx6="http://schemas.microsoft.com/office/drawing/2016/5/12/chartex" xmlns:cx7="http://schemas.microsoft.com/office/drawing/2016/5/13/chartex" xmlns:cx8="http://schemas.microsoft.com/office/drawing/2016/5/14/chartex" xmlns:mc="http://schemas.openxmlformats.org/markup-compatibility/2006" xmlns:aink="http://schemas.microsoft.com/office/drawing/2016/ink" xmlns:am3d="http://schemas.microsoft.com/office/drawing/2017/model3d" xmlns:o="urn:schemas-microsoft-com:office:office" xmlns:oel="http://schemas.microsoft.com/office/2019/extlst" xmlns:r="http://schemas.openxmlformats.org/officeDocument/2006/relationships" xmlns:m="http://schemas.openxmlformats.org/officeDocument/2006/math" xmlns:v="urn:schemas-microsoft-com:vml" xmlns:wp14="http://schemas.microsoft.com/office/word/2010/wordprocessingDrawing" xmlns:wp="http://schemas.openxmlformats.org/drawingml/2006/wordprocessingDrawing" xmlns:w10="urn:schemas-microsoft-com:office:word" xmlns:w="http://schemas.openxmlformats.org/wordprocessingml/2006/main" xmlns:w14="http://schemas.microsoft.com/office/word/2010/wordml" xmlns:w15="http://schemas.microsoft.com/office/word/2012/wordml" xmlns:w16cex="http://schemas.microsoft.com/office/word/2018/wordml/cex" xmlns:w16cid="http://schemas.microsoft.com/office/word/2016/wordml/cid" xmlns:w16="http://schemas.microsoft.com/office/word/2018/wordml" xmlns:w16du="http://schemas.microsoft.com/office/word/2023/wordml/word16du" xmlns:w16sdtdh="http://schemas.microsoft.com/office/word/2020/wordml/sdtdatahash" xmlns:w16sdtfl="http://schemas.microsoft.com/office/word/2024/wordml/sdtformatlock" xmlns:w16se="http://schemas.microsoft.com/office/word/2015/wordml/symex" xmlns:wpg="http://schemas.microsoft.com/office/word/2010/wordprocessingGroup" xmlns:wpi="http://schemas.microsoft.com/office/word/2010/wordprocessingInk" xmlns:wne="http://schemas.microsoft.com/office/word/2006/wordml" xmlns:wps="http://schemas.microsoft.com/office/word/2010/wordprocessingShape" mc:Ignorable="w14 w15 w16se w16cid w16 w16cex w16sdtdh w16sdtfl w16du wp14">
+  <w:abstractNum w:abstractNumId="0" w15:restartNumberingAfterBreak="0">
+    <w:nsid w:val="20E51FAE"/>
+    <w:multiLevelType w:val="multilevel"/>
+    <w:tmpl w:val="FCFA8C8A"/>
+    <w:lvl w:ilvl="0">
+      <w:start w:val="1"/>
+      <w:numFmt w:val="bullet"/>
+      <w:lvlText w:val=""/>
+      <w:lvlJc w:val="left"/>
+      <w:pPr>
+        <w:tabs>
+          <w:tab w:val="num" w:pos="720"/>
+        </w:tabs>
+        <w:ind w:left="720" w:hanging="360"/>
+      </w:pPr>
+      <w:rPr>
+        <w:rFonts w:ascii="Symbol" w:hAnsi="Symbol" w:hint="default"/>
+        <w:sz w:val="20"/>
+      </w:rPr>
+    </w:lvl>
+    <w:lvl w:ilvl="1" w:tentative="1">
+      <w:start w:val="1"/>
+      <w:numFmt w:val="bullet"/>
+      <w:lvlText w:val="o"/>
+      <w:lvlJc w:val="left"/>
+      <w:pPr>
+        <w:tabs>
+          <w:tab w:val="num" w:pos="1440"/>
+        </w:tabs>
+        <w:ind w:left="1440" w:hanging="360"/>
+      </w:pPr>
+      <w:rPr>
+        <w:rFonts w:ascii="Courier New" w:hAnsi="Courier New" w:hint="default"/>
+        <w:sz w:val="20"/>
+      </w:rPr>
+    </w:lvl>
+    <w:lvl w:ilvl="2" w:tentative="1">
+      <w:start w:val="1"/>
+      <w:numFmt w:val="bullet"/>
+      <w:lvlText w:val=""/>
+      <w:lvlJc w:val="left"/>
+      <w:pPr>
+        <w:tabs>
+          <w:tab w:val="num" w:pos="2160"/>
+        </w:tabs>
+        <w:ind w:left="2160" w:hanging="360"/>
+      </w:pPr>
+      <w:rPr>
+        <w:rFonts w:ascii="Wingdings" w:hAnsi="Wingdings" w:hint="default"/>
+        <w:sz w:val="20"/>
+      </w:rPr>
+    </w:lvl>
+    <w:lvl w:ilvl="3" w:tentative="1">
+      <w:start w:val="1"/>
+      <w:numFmt w:val="bullet"/>
+      <w:lvlText w:val=""/>
+      <w:lvlJc w:val="left"/>
+      <w:pPr>
+        <w:tabs>
+          <w:tab w:val="num" w:pos="2880"/>
+        </w:tabs>
+        <w:ind w:left="2880" w:hanging="360"/>
+      </w:pPr>
+      <w:rPr>
+        <w:rFonts w:ascii="Wingdings" w:hAnsi="Wingdings" w:hint="default"/>
+        <w:sz w:val="20"/>
+      </w:rPr>
+    </w:lvl>
+    <w:lvl w:ilvl="4" w:tentative="1">
+      <w:start w:val="1"/>
+      <w:numFmt w:val="bullet"/>
+      <w:lvlText w:val=""/>
+      <w:lvlJc w:val="left"/>
+      <w:pPr>
+        <w:tabs>
+          <w:tab w:val="num" w:pos="3600"/>
+        </w:tabs>
+        <w:ind w:left="3600" w:hanging="360"/>
+      </w:pPr>
+      <w:rPr>
+        <w:rFonts w:ascii="Wingdings" w:hAnsi="Wingdings" w:hint="default"/>
+        <w:sz w:val="20"/>
+      </w:rPr>
+    </w:lvl>
+    <w:lvl w:ilvl="5" w:tentative="1">
+      <w:start w:val="1"/>
+      <w:numFmt w:val="bullet"/>
+      <w:lvlText w:val=""/>
+      <w:lvlJc w:val="left"/>
+      <w:pPr>
+        <w:tabs>
+          <w:tab w:val="num" w:pos="4320"/>
+        </w:tabs>
+        <w:ind w:left="4320" w:hanging="360"/>
+      </w:pPr>
+      <w:rPr>
+        <w:rFonts w:ascii="Wingdings" w:hAnsi="Wingdings" w:hint="default"/>
+        <w:sz w:val="20"/>
+      </w:rPr>
+    </w:lvl>
+    <w:lvl w:ilvl="6" w:tentative="1">
+      <w:start w:val="1"/>
+      <w:numFmt w:val="bullet"/>
+      <w:lvlText w:val=""/>
+      <w:lvlJc w:val="left"/>
+      <w:pPr>
+        <w:tabs>
+          <w:tab w:val="num" w:pos="5040"/>
+        </w:tabs>
+        <w:ind w:left="5040" w:hanging="360"/>
+      </w:pPr>
+      <w:rPr>
+        <w:rFonts w:ascii="Wingdings" w:hAnsi="Wingdings" w:hint="default"/>
+        <w:sz w:val="20"/>
+      </w:rPr>
+    </w:lvl>
+    <w:lvl w:ilvl="7" w:tentative="1">
+      <w:start w:val="1"/>
+      <w:numFmt w:val="bullet"/>
+      <w:lvlText w:val=""/>
+      <w:lvlJc w:val="left"/>
+      <w:pPr>
+        <w:tabs>
+          <w:tab w:val="num" w:pos="5760"/>
+        </w:tabs>
+        <w:ind w:left="5760" w:hanging="360"/>
+      </w:pPr>
+      <w:rPr>
+        <w:rFonts w:ascii="Wingdings" w:hAnsi="Wingdings" w:hint="default"/>
+        <w:sz w:val="20"/>
+      </w:rPr>
+    </w:lvl>
+    <w:lvl w:ilvl="8" w:tentative="1">
+      <w:start w:val="1"/>
+      <w:numFmt w:val="bullet"/>
+      <w:lvlText w:val=""/>
+      <w:lvlJc w:val="left"/>
+      <w:pPr>
+        <w:tabs>
+          <w:tab w:val="num" w:pos="6480"/>
+        </w:tabs>
+        <w:ind w:left="6480" w:hanging="360"/>
+      </w:pPr>
+      <w:rPr>
+        <w:rFonts w:ascii="Wingdings" w:hAnsi="Wingdings" w:hint="default"/>
+        <w:sz w:val="20"/>
+      </w:rPr>
+    </w:lvl>
+  </w:abstractNum>
+  <w:num w:numId="1" w16cid:durableId="277028647">
+    <w:abstractNumId w:val="0"/>
+  </w:num>
+</w:numbering>
 </file>
 
 <file path=word/styles.xml><?xml version="1.0" encoding="utf-8"?>
@@ -2812,7 +3032,6 @@
   <w:style w:type="character" w:default="1" w:styleId="Fuentedeprrafopredeter">
     <w:name w:val="Default Paragraph Font"/>
     <w:uiPriority w:val="1"/>
-    <w:semiHidden/>
     <w:unhideWhenUsed/>
   </w:style>
   <w:style w:type="table" w:default="1" w:styleId="Tablanormal">
@@ -3545,6 +3764,15 @@
 </file>
 
 <file path=customXml/item1.xml><?xml version="1.0" encoding="utf-8"?>
+<?mso-contentType ?>
+<FormTemplates xmlns="http://schemas.microsoft.com/sharepoint/v3/contenttype/forms">
+  <Display>DocumentLibraryForm</Display>
+  <Edit>DocumentLibraryForm</Edit>
+  <New>DocumentLibraryForm</New>
+</FormTemplates>
+</file>
+
+<file path=customXml/item2.xml><?xml version="1.0" encoding="utf-8"?>
 <ct:contentTypeSchema xmlns:ct="http://schemas.microsoft.com/office/2006/metadata/contentType" xmlns:ma="http://schemas.microsoft.com/office/2006/metadata/properties/metaAttributes" ct:_="" ma:_="" ma:contentTypeName="Documento" ma:contentTypeID="0x01010098CE1D78FC632245B029FFE67C3A52E9" ma:contentTypeVersion="4" ma:contentTypeDescription="Crear nuevo documento." ma:contentTypeScope="" ma:versionID="444c84c3a83ceb57daf834ab012e2b6a">
   <xsd:schema xmlns:xsd="http://www.w3.org/2001/XMLSchema" xmlns:xs="http://www.w3.org/2001/XMLSchema" xmlns:p="http://schemas.microsoft.com/office/2006/metadata/properties" xmlns:ns3="0d319e56-4211-4e52-83f0-58f49797989a" targetNamespace="http://schemas.microsoft.com/office/2006/metadata/properties" ma:root="true" ma:fieldsID="ee5c279b902e44cfc2c3f89c2ebaaa7e" ns3:_="">
     <xsd:import namespace="0d319e56-4211-4e52-83f0-58f49797989a"/>
@@ -3688,22 +3916,21 @@
 </ct:contentTypeSchema>
 </file>
 
-<file path=customXml/item2.xml><?xml version="1.0" encoding="utf-8"?>
+<file path=customXml/item3.xml><?xml version="1.0" encoding="utf-8"?>
 <p:properties xmlns:p="http://schemas.microsoft.com/office/2006/metadata/properties" xmlns:xsi="http://www.w3.org/2001/XMLSchema-instance" xmlns:pc="http://schemas.microsoft.com/office/infopath/2007/PartnerControls">
   <documentManagement/>
 </p:properties>
 </file>
 
-<file path=customXml/item3.xml><?xml version="1.0" encoding="utf-8"?>
-<?mso-contentType ?>
-<FormTemplates xmlns="http://schemas.microsoft.com/sharepoint/v3/contenttype/forms">
-  <Display>DocumentLibraryForm</Display>
-  <Edit>DocumentLibraryForm</Edit>
-  <New>DocumentLibraryForm</New>
-</FormTemplates>
+<file path=customXml/itemProps1.xml><?xml version="1.0" encoding="utf-8"?>
+<ds:datastoreItem xmlns:ds="http://schemas.openxmlformats.org/officeDocument/2006/customXml" ds:itemID="{2B93DEC2-8C80-4466-A26F-F7157091F69A}">
+  <ds:schemaRefs>
+    <ds:schemaRef ds:uri="http://schemas.microsoft.com/sharepoint/v3/contenttype/forms"/>
+  </ds:schemaRefs>
+</ds:datastoreItem>
 </file>
 
-<file path=customXml/itemProps1.xml><?xml version="1.0" encoding="utf-8"?>
+<file path=customXml/itemProps2.xml><?xml version="1.0" encoding="utf-8"?>
 <ds:datastoreItem xmlns:ds="http://schemas.openxmlformats.org/officeDocument/2006/customXml" ds:itemID="{0F445897-B7EA-44D2-BA92-6628C256B229}">
   <ds:schemaRefs>
     <ds:schemaRef ds:uri="http://schemas.microsoft.com/office/2006/metadata/contentType"/>
@@ -3721,19 +3948,11 @@
 </ds:datastoreItem>
 </file>
 
-<file path=customXml/itemProps2.xml><?xml version="1.0" encoding="utf-8"?>
+<file path=customXml/itemProps3.xml><?xml version="1.0" encoding="utf-8"?>
 <ds:datastoreItem xmlns:ds="http://schemas.openxmlformats.org/officeDocument/2006/customXml" ds:itemID="{86806066-58CC-48AB-9171-94BA2726B27E}">
   <ds:schemaRefs>
     <ds:schemaRef ds:uri="http://schemas.microsoft.com/office/2006/metadata/properties"/>
     <ds:schemaRef ds:uri="http://schemas.microsoft.com/office/infopath/2007/PartnerControls"/>
   </ds:schemaRefs>
 </ds:datastoreItem>
-</file>
-
-<file path=customXml/itemProps3.xml><?xml version="1.0" encoding="utf-8"?>
-<ds:datastoreItem xmlns:ds="http://schemas.openxmlformats.org/officeDocument/2006/customXml" ds:itemID="{2B93DEC2-8C80-4466-A26F-F7157091F69A}">
-  <ds:schemaRefs>
-    <ds:schemaRef ds:uri="http://schemas.microsoft.com/sharepoint/v3/contenttype/forms"/>
-  </ds:schemaRefs>
-</ds:datastoreItem>
 </file>
</xml_diff>